<commit_message>
Add lecture materials for MDPs I: video and PDF
</commit_message>
<xml_diff>
--- a/Fall 2026/_L03 - Adversarial Search and Games/Chapter 5 -Adversarial Search and Games.docx
+++ b/Fall 2026/_L03 - Adversarial Search and Games/Chapter 5 -Adversarial Search and Games.docx
@@ -326,7 +326,6 @@
           <w:numId w:val="1"/>
         </w:numPr>
         <w:tabs>
-          <w:tab w:val="clear" w:pos="709"/>
           <w:tab w:val="left" w:pos="709" w:leader="none"/>
         </w:tabs>
         <w:bidi w:val="0"/>
@@ -357,7 +356,6 @@
           <w:numId w:val="1"/>
         </w:numPr>
         <w:tabs>
-          <w:tab w:val="clear" w:pos="709"/>
           <w:tab w:val="left" w:pos="709" w:leader="none"/>
         </w:tabs>
         <w:bidi w:val="0"/>
@@ -378,7 +376,6 @@
           <w:numId w:val="1"/>
         </w:numPr>
         <w:tabs>
-          <w:tab w:val="clear" w:pos="709"/>
           <w:tab w:val="left" w:pos="709" w:leader="none"/>
         </w:tabs>
         <w:bidi w:val="0"/>
@@ -399,7 +396,6 @@
           <w:numId w:val="1"/>
         </w:numPr>
         <w:tabs>
-          <w:tab w:val="clear" w:pos="709"/>
           <w:tab w:val="left" w:pos="709" w:leader="none"/>
         </w:tabs>
         <w:bidi w:val="0"/>
@@ -430,7 +426,6 @@
           <w:numId w:val="1"/>
         </w:numPr>
         <w:tabs>
-          <w:tab w:val="clear" w:pos="709"/>
           <w:tab w:val="left" w:pos="709" w:leader="none"/>
         </w:tabs>
         <w:bidi w:val="0"/>
@@ -471,7 +466,6 @@
           <w:numId w:val="1"/>
         </w:numPr>
         <w:tabs>
-          <w:tab w:val="clear" w:pos="709"/>
           <w:tab w:val="left" w:pos="709" w:leader="none"/>
         </w:tabs>
         <w:bidi w:val="0"/>
@@ -578,6 +572,7 @@
       <w:pPr>
         <w:pStyle w:val="BodyText"/>
         <w:bidi w:val="0"/>
+        <w:spacing w:before="0" w:after="140"/>
         <w:jc w:val="start"/>
         <w:rPr/>
       </w:pPr>
@@ -586,10 +581,10 @@
           <wp:anchor distT="0" distB="0" distL="0" distR="0" simplePos="0" relativeHeight="2" behindDoc="0" locked="0" layoutInCell="0" allowOverlap="1">
             <wp:simplePos x="0" y="0"/>
             <wp:positionH relativeFrom="column">
-              <wp:posOffset>142875</wp:posOffset>
+              <wp:posOffset>1258570</wp:posOffset>
             </wp:positionH>
             <wp:positionV relativeFrom="paragraph">
-              <wp:posOffset>34290</wp:posOffset>
+              <wp:posOffset>-60960</wp:posOffset>
             </wp:positionV>
             <wp:extent cx="3272790" cy="2865120"/>
             <wp:effectExtent l="0" t="0" r="0" b="0"/>
@@ -696,6 +691,7 @@
       <w:pPr>
         <w:pStyle w:val="Heading2"/>
         <w:bidi w:val="0"/>
+        <w:spacing w:before="0" w:after="120"/>
         <w:jc w:val="start"/>
         <w:rPr/>
       </w:pPr>
@@ -1378,6 +1374,7 @@
       <w:pPr>
         <w:pStyle w:val="Heading2"/>
         <w:bidi w:val="0"/>
+        <w:spacing w:before="0" w:after="120"/>
         <w:jc w:val="start"/>
         <w:rPr/>
       </w:pPr>
@@ -1671,7 +1668,7 @@
             </wp:positionV>
             <wp:extent cx="4914265" cy="1200150"/>
             <wp:effectExtent l="0" t="0" r="0" b="0"/>
-            <wp:wrapSquare wrapText="largest"/>
+            <wp:wrapTopAndBottom/>
             <wp:docPr id="7" name="Image6"/>
             <wp:cNvGraphicFramePr>
               <a:graphicFrameLocks xmlns:a="http://schemas.openxmlformats.org/drawingml/2006/main" noChangeAspect="1"/>
@@ -1783,84 +1780,24 @@
         <w:rPr>
           <w:rStyle w:val="Strong"/>
         </w:rPr>
+        <w:br/>
+      </w:r>
+      <w:r>
+        <w:br w:type="page"/>
+      </w:r>
+    </w:p>
+    <w:p>
+      <w:pPr>
+        <w:pStyle w:val="BodyText"/>
+        <w:bidi w:val="0"/>
+        <w:jc w:val="start"/>
+        <w:rPr/>
+      </w:pPr>
+      <w:r>
+        <w:rPr>
+          <w:rStyle w:val="Strong"/>
+        </w:rPr>
         <w:t>Figure 5.6</w:t>
-      </w:r>
-    </w:p>
-    <w:p>
-      <w:pPr>
-        <w:pStyle w:val="Normal"/>
-        <w:bidi w:val="0"/>
-        <w:jc w:val="start"/>
-        <w:rPr/>
-      </w:pPr>
-      <w:r>
-        <w:rPr/>
-      </w:r>
-    </w:p>
-    <w:p>
-      <w:pPr>
-        <w:pStyle w:val="Normal"/>
-        <w:bidi w:val="0"/>
-        <w:jc w:val="start"/>
-        <w:rPr/>
-      </w:pPr>
-      <w:r>
-        <w:rPr/>
-      </w:r>
-    </w:p>
-    <w:p>
-      <w:pPr>
-        <w:pStyle w:val="Normal"/>
-        <w:bidi w:val="0"/>
-        <w:jc w:val="start"/>
-        <w:rPr/>
-      </w:pPr>
-      <w:r>
-        <w:rPr/>
-      </w:r>
-    </w:p>
-    <w:p>
-      <w:pPr>
-        <w:pStyle w:val="Normal"/>
-        <w:bidi w:val="0"/>
-        <w:jc w:val="start"/>
-        <w:rPr/>
-      </w:pPr>
-      <w:r>
-        <w:rPr/>
-      </w:r>
-    </w:p>
-    <w:p>
-      <w:pPr>
-        <w:pStyle w:val="Normal"/>
-        <w:bidi w:val="0"/>
-        <w:jc w:val="start"/>
-        <w:rPr/>
-      </w:pPr>
-      <w:r>
-        <w:rPr/>
-      </w:r>
-    </w:p>
-    <w:p>
-      <w:pPr>
-        <w:pStyle w:val="Normal"/>
-        <w:bidi w:val="0"/>
-        <w:jc w:val="start"/>
-        <w:rPr/>
-      </w:pPr>
-      <w:r>
-        <w:rPr/>
-      </w:r>
-    </w:p>
-    <w:p>
-      <w:pPr>
-        <w:pStyle w:val="Normal"/>
-        <w:bidi w:val="0"/>
-        <w:jc w:val="start"/>
-        <w:rPr/>
-      </w:pPr>
-      <w:r>
-        <w:rPr/>
       </w:r>
     </w:p>
     <w:p>
@@ -1883,7 +1820,7 @@
             </wp:positionV>
             <wp:extent cx="6219190" cy="4209415"/>
             <wp:effectExtent l="0" t="0" r="0" b="0"/>
-            <wp:wrapSquare wrapText="largest"/>
+            <wp:wrapTopAndBottom/>
             <wp:docPr id="8" name="Image8"/>
             <wp:cNvGraphicFramePr>
               <a:graphicFrameLocks xmlns:a="http://schemas.openxmlformats.org/drawingml/2006/main" noChangeAspect="1"/>
@@ -1973,6 +1910,7 @@
       <w:pPr>
         <w:pStyle w:val="BodyText"/>
         <w:bidi w:val="0"/>
+        <w:spacing w:before="0" w:after="140"/>
         <w:jc w:val="start"/>
         <w:rPr/>
       </w:pPr>
@@ -2402,6 +2340,7 @@
       <w:pPr>
         <w:pStyle w:val="Heading2"/>
         <w:bidi w:val="0"/>
+        <w:spacing w:before="0" w:after="120"/>
         <w:jc w:val="start"/>
         <w:rPr/>
       </w:pPr>
@@ -3099,6 +3038,7 @@
       <w:pPr>
         <w:pStyle w:val="Heading2"/>
         <w:bidi w:val="0"/>
+        <w:spacing w:before="0" w:after="120"/>
         <w:jc w:val="start"/>
         <w:rPr/>
       </w:pPr>
@@ -3620,6 +3560,7 @@
       <w:pgNumType w:fmt="decimal"/>
       <w:formProt w:val="false"/>
       <w:textDirection w:val="lrTb"/>
+      <w:docGrid w:type="default" w:linePitch="100" w:charSpace="0"/>
     </w:sectPr>
   </w:body>
 </w:document>
@@ -3768,7 +3709,6 @@
     <w:lvl w:ilvl="0">
       <w:start w:val="1"/>
       <w:numFmt w:val="none"/>
-      <w:pStyle w:val="Heading1"/>
       <w:suff w:val="nothing"/>
       <w:lvlText w:val=""/>
       <w:lvlJc w:val="start"/>
@@ -3782,7 +3722,6 @@
     <w:lvl w:ilvl="1">
       <w:start w:val="1"/>
       <w:numFmt w:val="none"/>
-      <w:pStyle w:val="Heading2"/>
       <w:suff w:val="nothing"/>
       <w:lvlText w:val=""/>
       <w:lvlJc w:val="start"/>
@@ -3908,7 +3847,6 @@
     </w:rPrDefault>
     <w:pPrDefault>
       <w:pPr>
-        <w:widowControl/>
         <w:suppressAutoHyphens w:val="true"/>
       </w:pPr>
     </w:pPrDefault>
@@ -3918,7 +3856,10 @@
     <w:qFormat/>
     <w:pPr>
       <w:widowControl/>
+      <w:suppressAutoHyphens w:val="true"/>
       <w:bidi w:val="0"/>
+      <w:spacing w:before="0" w:after="0"/>
+      <w:jc w:val="start"/>
     </w:pPr>
     <w:rPr>
       <w:rFonts w:ascii="Liberation Serif" w:hAnsi="Liberation Serif" w:eastAsia="Noto Sans" w:cs="FreeSans"/>
@@ -3979,8 +3920,8 @@
       <w:bCs/>
     </w:rPr>
   </w:style>
-  <w:style w:type="character" w:styleId="Bullets">
-    <w:name w:val="Bullets"/>
+  <w:style w:type="character" w:styleId="Bulletsuser">
+    <w:name w:val="Bullets (user)"/>
     <w:qFormat/>
     <w:rPr>
       <w:rFonts w:ascii="OpenSymbol" w:hAnsi="OpenSymbol" w:eastAsia="OpenSymbol" w:cs="OpenSymbol"/>

</xml_diff>